<commit_message>
Updated GDD to v0.7 and corrected author name across docs
Current Status and Change Log now reflect Draft 1 presented, the
Perforce migration and the BCIT Vicon Nexus mocap prep; also fixed
formatting inconsistencies (badge colours, caption style, one
undersized table, missing table font-size overrides, capitalization
after bold labels) and replaced Joseph Driedger with Joey Driedger
throughout the design docs.
</commit_message>
<xml_diff>
--- a/Docs/Open_Stance_Preliminary_Project_Plan.docx
+++ b/Docs/Open_Stance_Preliminary_Project_Plan.docx
@@ -3576,58 +3576,16 @@
           <w:sz w:val="19"/>
         </w:rPr>
         <w:t>Fighter</w:t>
-      </w:r>
-      <w:r>
-        <w:rPr>
-          <w:rFonts w:ascii="Consolas" w:hAnsi="Consolas"/>
-          <w:sz w:val="19"/>
-        </w:rPr>
         <w:br/>
-      </w:r>
-      <w:r>
-        <w:rPr>
-          <w:rFonts w:ascii="Consolas" w:hAnsi="Consolas"/>
-          <w:sz w:val="19"/>
-        </w:rPr>
         <w:t xml:space="preserve">  • CurrentStance: LeftLead / RightLead</w:t>
-      </w:r>
-      <w:r>
-        <w:rPr>
-          <w:rFonts w:ascii="Consolas" w:hAnsi="Consolas"/>
-          <w:sz w:val="19"/>
-        </w:rPr>
         <w:br/>
         <w:t xml:space="preserve">  • CurrentGuard</w:t>
-      </w:r>
-      <w:r>
-        <w:rPr>
-          <w:rFonts w:ascii="Consolas" w:hAnsi="Consolas"/>
-          <w:sz w:val="19"/>
-        </w:rPr>
         <w:br/>
         <w:t xml:space="preserve">  • LeadLeg / RearLeg</w:t>
-      </w:r>
-      <w:r>
-        <w:rPr>
-          <w:rFonts w:ascii="Consolas" w:hAnsi="Consolas"/>
-          <w:sz w:val="19"/>
-        </w:rPr>
         <w:br/>
         <w:t xml:space="preserve">  • CombatState</w:t>
-      </w:r>
-      <w:r>
-        <w:rPr>
-          <w:rFonts w:ascii="Consolas" w:hAnsi="Consolas"/>
-          <w:sz w:val="19"/>
-        </w:rPr>
         <w:br/>
         <w:t xml:space="preserve">  • Stamina</w:t>
-      </w:r>
-      <w:r>
-        <w:rPr>
-          <w:rFonts w:ascii="Consolas" w:hAnsi="Consolas"/>
-          <w:sz w:val="19"/>
-        </w:rPr>
         <w:br/>
         <w:t xml:space="preserve">  • Score / MatchState</w:t>
       </w:r>
@@ -3644,12 +3602,6 @@
           <w:sz w:val="19"/>
         </w:rPr>
         <w:t>Idle / Movement → Chamber → Attack Startup → Attack Active → Attack Recovery</w:t>
-      </w:r>
-      <w:r>
-        <w:rPr>
-          <w:rFonts w:ascii="Consolas" w:hAnsi="Consolas"/>
-          <w:sz w:val="19"/>
-        </w:rPr>
         <w:br/>
         <w:t>Blocking / Defense → Hit Reaction → Staggered → Knocked Down → Recovering → Match Finished</w:t>
       </w:r>

</xml_diff>